<commit_message>
WasteWerx one-pager: fold in meeting details (ASTM, agency, $1,500 first step)
Light edits from the coordination call:
- Name ASTM as the quality standard; UCF helps shorten the certification
  timeline (per the UCF fuel-program discussion).
- Timing note: likely DOE or USDA for a waste-to-fuel STTR.
- Add "The small first step" — a modest $1,500 grant-fit / due-diligence
  engagement that credits toward the award work, so it's easy to say yes to.

https://claude.ai/code/session_01NNVRfcBeiW4jRftzrwemzW
</commit_message>
<xml_diff>
--- a/docs/business/final_deck/PublicLogic - WasteWerx Funding Path (STTR one-pager).docx
+++ b/docs/business/final_deck/PublicLogic - WasteWerx Funding Path (STTR one-pager).docx
@@ -103,7 +103,7 @@
                 <w:color w:val="FFFFFF"/>
                 <w:sz w:val="23"/>
               </w:rPr>
-              <w:t>Can the WasteWerx process turn everyday waste — tires, mixed plastics, wood — into clean jet and diesel fuel that meets the industry’s quality bar, in one pass, with a carbon footprint a buyer can trust? A university saying yes to that is worth far more than a vendor saying it.</w:t>
+              <w:t>Can the WasteWerx process turn everyday waste — tires, mixed plastics, wood — into clean jet and diesel fuel that meets the industry’s quality bar (the ASTM standard), in one pass, with a carbon footprint a buyer can trust? A university saying yes to that is worth far more than a vendor saying it.</w:t>
             </w:r>
           </w:p>
         </w:tc>
@@ -374,7 +374,7 @@
                 <w:color w:val="1A1D20"/>
                 <w:sz w:val="18"/>
               </w:rPr>
-              <w:t>Test the fuel against the industry quality standards</w:t>
+              <w:t>Test the fuel against the ASTM quality standards</w:t>
             </w:r>
           </w:p>
           <w:p>
@@ -416,6 +416,27 @@
                 <w:color w:val="1A1D20"/>
                 <w:sz w:val="18"/>
               </w:rPr>
+              <w:t>Help shorten the ASTM certification timeline</w:t>
+            </w:r>
+          </w:p>
+          <w:p>
+            <w:pPr>
+              <w:spacing w:after="40" w:line="245" w:lineRule="auto"/>
+            </w:pPr>
+            <w:r>
+              <w:rPr>
+                <w:rFonts w:ascii="Calibri" w:hAnsi="Calibri"/>
+                <w:color w:val="A9772F"/>
+                <w:sz w:val="18"/>
+              </w:rPr>
+              <w:t xml:space="preserve">• </w:t>
+            </w:r>
+            <w:r>
+              <w:rPr>
+                <w:rFonts w:ascii="Calibri" w:hAnsi="Calibri"/>
+                <w:color w:val="1A1D20"/>
+                <w:sz w:val="18"/>
+              </w:rPr>
               <w:t>Measure the real carbon footprint, start to finish</w:t>
             </w:r>
           </w:p>
@@ -437,28 +458,7 @@
                 <w:color w:val="1A1D20"/>
                 <w:sz w:val="18"/>
               </w:rPr>
-              <w:t>Put a university name on the results — the credibility layer</w:t>
-            </w:r>
-          </w:p>
-          <w:p>
-            <w:pPr>
-              <w:spacing w:after="40" w:line="245" w:lineRule="auto"/>
-            </w:pPr>
-            <w:r>
-              <w:rPr>
-                <w:rFonts w:ascii="Calibri" w:hAnsi="Calibri"/>
-                <w:color w:val="A9772F"/>
-                <w:sz w:val="18"/>
-              </w:rPr>
-              <w:t xml:space="preserve">• </w:t>
-            </w:r>
-            <w:r>
-              <w:rPr>
-                <w:rFonts w:ascii="Calibri" w:hAnsi="Calibri"/>
-                <w:color w:val="1A1D20"/>
-                <w:sz w:val="18"/>
-              </w:rPr>
-              <w:t>Supply the university research lead the grant requires</w:t>
+              <w:t>Put a university name on the results — and supply the research lead the grant requires</w:t>
             </w:r>
           </w:p>
         </w:tc>
@@ -854,7 +854,39 @@
           <w:color w:val="1A1D20"/>
           <w:sz w:val="20"/>
         </w:rPr>
-        <w:t>The program has been reauthorized through September 30, 2031, and the next step is matching the project to the right agency solicitation cycle. From there the work is assembling the package and pairing the project with the right UCF researcher — we’ll work through UCF’s research office to land that fit, and PublicLogic coordinates the rest. One honest note: every grant is competitive, and we won’t put anything forward that doesn’t position WasteWerx as a clear contender. The point of getting in early is to build exactly that kind of application.</w:t>
+        <w:t>The program has been reauthorized through September 30, 2031, and the next step is matching the project to the right agency solicitation cycle — for a waste-to-fuel process, most likely DOE or USDA. From there the work is assembling the package and pairing the project with the right UCF researcher — we’ll work through UCF’s research office to land that fit, and PublicLogic coordinates the rest. One honest note: every grant is competitive, and we won’t put anything forward that doesn’t position WasteWerx as a clear contender. The point of getting in early is to build exactly that kind of application.</w:t>
+      </w:r>
+    </w:p>
+    <w:p>
+      <w:pPr>
+        <w:spacing w:before="160" w:after="20" w:line="252" w:lineRule="auto"/>
+        <w:jc w:val="left"/>
+      </w:pPr>
+      <w:r>
+        <w:rPr>
+          <w:rFonts w:ascii="Calibri" w:hAnsi="Calibri"/>
+          <w:b/>
+          <w:i w:val="0"/>
+          <w:color w:val="0F4C3A"/>
+          <w:sz w:val="21"/>
+        </w:rPr>
+        <w:t>THE SMALL FIRST STEP</w:t>
+      </w:r>
+    </w:p>
+    <w:p>
+      <w:pPr>
+        <w:spacing w:before="40" w:after="80" w:line="252" w:lineRule="auto"/>
+        <w:jc w:val="left"/>
+      </w:pPr>
+      <w:r>
+        <w:rPr>
+          <w:rFonts w:ascii="Calibri" w:hAnsi="Calibri"/>
+          <w:b w:val="0"/>
+          <w:i w:val="0"/>
+          <w:color w:val="1A1D20"/>
+          <w:sz w:val="20"/>
+        </w:rPr>
+        <w:t>To get moving without a big commitment, PublicLogic will run the initial grant-fit and due-diligence work — confirming the best agency, the solicitation window, and how competitive WasteWerx would be — for a modest fixed fee of $1,500. If we proceed to the application, it credits toward the grant-management work. It’s the fastest way to turn this from a good idea into a filed application.</w:t>
       </w:r>
     </w:p>
     <w:tbl>

</xml_diff>

<commit_message>
WasteWerx one-pager: right-size Allie's bio (less salesly)
Trim the adoption-layer paragraph: drop the credential pile-up (MSW/LICSW/
BCBA) that isn't relevant to fuel adoption and the self-justifying
"reviewers increasingly look for..." line. Keep the substantive, relevant
core — PsyD in Leadership Psychology, research on why orgs lose new
practices, the CFIR-based adoption plan. Full CV belongs in the STTR
biosketch, not the pre-read.

https://claude.ai/code/session_01NNVRfcBeiW4jRftzrwemzW
</commit_message>
<xml_diff>
--- a/docs/business/final_deck/PublicLogic - WasteWerx Funding Path (STTR one-pager).docx
+++ b/docs/business/final_deck/PublicLogic - WasteWerx Funding Path (STTR one-pager).docx
@@ -604,7 +604,7 @@
           <w:color w:val="0F4C3A"/>
           <w:sz w:val="21"/>
         </w:rPr>
-        <w:t>THE ADOPTION LAYER — AND WHO LEADS IT</w:t>
+        <w:t>THE ADOPTION LAYER</w:t>
       </w:r>
     </w:p>
     <w:p>
@@ -620,7 +620,7 @@
           <w:color w:val="1A1D20"/>
           <w:sz w:val="20"/>
         </w:rPr>
-        <w:t>UCF proves the fuel is real. Getting a town, a hauler, or a plant operator to actually run the system, trust it, and keep using it is a different problem. PublicLogic’s organizational implementation work is led by Dr. Allison Weiss Rothschild. She holds a PsyD in Leadership Psychology from William James College and an MSW from Boston College, with licenses as a Clinical Social Worker (LICSW) and Behavior Analyst (BCBA/LABA), and has spent her career inside multi-site, regulated human-services organizations. Her doctoral work looked at why organizations struggle to hold onto new practices and staff buy-in after a strong start — the same problem a new technology runs into once the demonstration phase ends. She draws on CFIR, a framework researchers use to assess whether a new system actually takes hold in an organization, to build the training and adoption plan that carries a project past the lab bench. Reviewers increasingly look for teams with a credible path to real-world adoption, not just technical feasibility, and that’s the piece PublicLogic adds to the partnership.</w:t>
+        <w:t>UCF proves the fuel is real. Getting a town, a hauler, or a plant operator to actually run the system — and keep using it — is a different problem, and it’s the one PublicLogic’s Dr. Allison Weiss Rothschild works on. A PsyD in Leadership Psychology, her research is on why organizations lose new practices after a strong start — exactly what happens to a new technology once the demonstration ends. She builds the training and adoption plan (using CFIR, a standard framework for whether a new system actually takes hold) that carries the project past the lab bench.</w:t>
       </w:r>
     </w:p>
     <w:p>

</xml_diff>

<commit_message>
WasteWerx one-pager: preempt the $1,500 objection + define cost-share
Apply the two useful review notes: add a plain de-risk line to the small
first step ("if we don't find a fit, you're out $1,500 and know the
landscape — cheaper than chasing the wrong grant") and a parenthetical
defining cost-share ("the match some federal grants ask for"). Skipped the
premature suggestions (percentage splits, naming a specific DOE office).

https://claude.ai/code/session_01NNVRfcBeiW4jRftzrwemzW
</commit_message>
<xml_diff>
--- a/docs/business/final_deck/PublicLogic - WasteWerx Funding Path (STTR one-pager).docx
+++ b/docs/business/final_deck/PublicLogic - WasteWerx Funding Path (STTR one-pager).docx
@@ -702,7 +702,7 @@
           <w:color w:val="1A1D20"/>
           <w:sz w:val="20"/>
         </w:rPr>
-        <w:t>A modest in-kind commitment of machine time and materials, which also counts toward the grant’s cost-share.</w:t>
+        <w:t>A modest in-kind commitment of machine time and materials, which also counts toward the grant’s cost-share (the match some federal grants ask for).</w:t>
       </w:r>
     </w:p>
     <w:p>
@@ -886,7 +886,7 @@
           <w:color w:val="1A1D20"/>
           <w:sz w:val="20"/>
         </w:rPr>
-        <w:t>To get moving without a big commitment, PublicLogic will run the initial grant-fit and due-diligence work — confirming the best agency, the solicitation window, and how competitive WasteWerx would be — for a modest fixed fee of $1,500. If we proceed to the application, it credits toward the grant-management work. It’s the fastest way to turn this from a good idea into a filed application.</w:t>
+        <w:t>To get moving without a big commitment, PublicLogic will run the initial grant-fit and due-diligence work — confirming the best agency, the solicitation window, and how competitive WasteWerx would be — for a modest fixed fee of $1,500. If we proceed to the application, it credits toward the grant-management work. And if we don’t find a strong fit, you’re out $1,500 and you know the landscape — cheaper than chasing the wrong grant. It’s the fastest way to turn this from a good idea into a filed application.</w:t>
       </w:r>
     </w:p>
     <w:tbl>

</xml_diff>